<commit_message>
🎨 Update template styling: Change heading colors from black to red - Update all DOCX templates with new red heading color scheme - Maintain consistent branding across all document templates - Apply styling changes to master templates and backups
</commit_message>
<xml_diff>
--- a/templates/docx_templates/1. backups/module_activity_sheet_master.docx
+++ b/templates/docx_templates/1. backups/module_activity_sheet_master.docx
@@ -5,10 +5,16 @@
     <w:p>
       <w:pPr>
         <w:pStyle w:val="Title"/>
+        <w:rPr>
+          <w:rFonts w:ascii="Segoe UI" w:hAnsi="Segoe UI" w:cs="Segoe UI"/>
+          <w:color w:val="DE0B20"/>
+        </w:rPr>
       </w:pPr>
       <w:r>
         <w:rPr>
+          <w:rFonts w:ascii="Segoe UI" w:hAnsi="Segoe UI" w:cs="Segoe UI"/>
           <w:noProof/>
+          <w:color w:val="DE0B20"/>
         </w:rPr>
         <w:drawing>
           <wp:anchor distT="0" distB="0" distL="0" distR="0" simplePos="0" relativeHeight="15729152" behindDoc="0" locked="0" layoutInCell="1" allowOverlap="1" wp14:anchorId="37D2C8E4" wp14:editId="2C71AED7">
@@ -55,16 +61,24 @@
         </w:drawing>
       </w:r>
       <w:r>
+        <w:rPr>
+          <w:rFonts w:ascii="Segoe UI" w:hAnsi="Segoe UI" w:cs="Segoe UI"/>
+          <w:color w:val="DE0B20"/>
+        </w:rPr>
         <w:t>Module</w:t>
       </w:r>
       <w:r>
         <w:rPr>
+          <w:rFonts w:ascii="Segoe UI" w:hAnsi="Segoe UI" w:cs="Segoe UI"/>
+          <w:color w:val="DE0B20"/>
           <w:spacing w:val="-11"/>
         </w:rPr>
         <w:t xml:space="preserve"> </w:t>
       </w:r>
       <w:r>
         <w:rPr>
+          <w:rFonts w:ascii="Segoe UI" w:hAnsi="Segoe UI" w:cs="Segoe UI"/>
+          <w:color w:val="DE0B20"/>
           <w:spacing w:val="-4"/>
         </w:rPr>
         <w:t>Name</w:t>
@@ -75,17 +89,20 @@
         <w:spacing w:before="6"/>
         <w:ind w:left="179"/>
         <w:rPr>
+          <w:rFonts w:ascii="Segoe UI" w:hAnsi="Segoe UI" w:cs="Segoe UI"/>
           <w:sz w:val="28"/>
         </w:rPr>
       </w:pPr>
       <w:r>
         <w:rPr>
+          <w:rFonts w:ascii="Segoe UI" w:hAnsi="Segoe UI" w:cs="Segoe UI"/>
           <w:sz w:val="28"/>
         </w:rPr>
         <w:t>Module</w:t>
       </w:r>
       <w:r>
         <w:rPr>
+          <w:rFonts w:ascii="Segoe UI" w:hAnsi="Segoe UI" w:cs="Segoe UI"/>
           <w:spacing w:val="-9"/>
           <w:sz w:val="28"/>
         </w:rPr>
@@ -93,12 +110,14 @@
       </w:r>
       <w:r>
         <w:rPr>
+          <w:rFonts w:ascii="Segoe UI" w:hAnsi="Segoe UI" w:cs="Segoe UI"/>
           <w:sz w:val="28"/>
         </w:rPr>
         <w:t>Activity</w:t>
       </w:r>
       <w:r>
         <w:rPr>
+          <w:rFonts w:ascii="Segoe UI" w:hAnsi="Segoe UI" w:cs="Segoe UI"/>
           <w:spacing w:val="-9"/>
           <w:sz w:val="28"/>
         </w:rPr>
@@ -106,6 +125,7 @@
       </w:r>
       <w:r>
         <w:rPr>
+          <w:rFonts w:ascii="Segoe UI" w:hAnsi="Segoe UI" w:cs="Segoe UI"/>
           <w:spacing w:val="-2"/>
           <w:sz w:val="28"/>
         </w:rPr>
@@ -117,11 +137,13 @@
         <w:pStyle w:val="BodyText"/>
         <w:spacing w:before="0"/>
         <w:rPr>
+          <w:rFonts w:ascii="Segoe UI" w:hAnsi="Segoe UI" w:cs="Segoe UI"/>
           <w:sz w:val="3"/>
         </w:rPr>
       </w:pPr>
       <w:r>
         <w:rPr>
+          <w:rFonts w:ascii="Segoe UI" w:hAnsi="Segoe UI" w:cs="Segoe UI"/>
           <w:noProof/>
         </w:rPr>
         <w:drawing>
@@ -177,12 +199,25 @@
         </w:tabs>
         <w:spacing w:before="199"/>
         <w:ind w:left="179"/>
+        <w:rPr>
+          <w:rFonts w:ascii="Segoe UI" w:hAnsi="Segoe UI" w:cs="Segoe UI"/>
+          <w:b/>
+          <w:bCs/>
+        </w:rPr>
       </w:pPr>
       <w:r>
+        <w:rPr>
+          <w:rFonts w:ascii="Segoe UI" w:hAnsi="Segoe UI" w:cs="Segoe UI"/>
+          <w:b/>
+          <w:bCs/>
+        </w:rPr>
         <w:t xml:space="preserve">Name: </w:t>
       </w:r>
       <w:r>
         <w:rPr>
+          <w:rFonts w:ascii="Segoe UI" w:hAnsi="Segoe UI" w:cs="Segoe UI"/>
+          <w:b/>
+          <w:bCs/>
           <w:u w:val="single"/>
         </w:rPr>
         <w:tab/>
@@ -193,6 +228,7 @@
         <w:pStyle w:val="BodyText"/>
         <w:spacing w:before="7"/>
         <w:rPr>
+          <w:rFonts w:ascii="Segoe UI" w:hAnsi="Segoe UI" w:cs="Segoe UI"/>
           <w:sz w:val="5"/>
         </w:rPr>
       </w:pPr>
@@ -234,17 +270,26 @@
               <w:pStyle w:val="TableParagraph"/>
               <w:spacing w:before="86"/>
               <w:rPr>
-                <w:sz w:val="24"/>
-              </w:rPr>
-            </w:pPr>
-            <w:r>
-              <w:rPr>
+                <w:rFonts w:ascii="Segoe UI" w:hAnsi="Segoe UI" w:cs="Segoe UI"/>
+                <w:b/>
+                <w:bCs/>
+                <w:sz w:val="24"/>
+              </w:rPr>
+            </w:pPr>
+            <w:r>
+              <w:rPr>
+                <w:rFonts w:ascii="Segoe UI" w:hAnsi="Segoe UI" w:cs="Segoe UI"/>
+                <w:b/>
+                <w:bCs/>
                 <w:sz w:val="24"/>
               </w:rPr>
               <w:t xml:space="preserve">Session </w:t>
             </w:r>
             <w:r>
               <w:rPr>
+                <w:rFonts w:ascii="Segoe UI" w:hAnsi="Segoe UI" w:cs="Segoe UI"/>
+                <w:b/>
+                <w:bCs/>
                 <w:spacing w:val="-5"/>
                 <w:sz w:val="24"/>
               </w:rPr>
@@ -262,17 +307,26 @@
               <w:pStyle w:val="TableParagraph"/>
               <w:spacing w:before="86"/>
               <w:rPr>
-                <w:sz w:val="24"/>
-              </w:rPr>
-            </w:pPr>
-            <w:r>
-              <w:rPr>
+                <w:rFonts w:ascii="Segoe UI" w:hAnsi="Segoe UI" w:cs="Segoe UI"/>
+                <w:b/>
+                <w:bCs/>
+                <w:sz w:val="24"/>
+              </w:rPr>
+            </w:pPr>
+            <w:r>
+              <w:rPr>
+                <w:rFonts w:ascii="Segoe UI" w:hAnsi="Segoe UI" w:cs="Segoe UI"/>
+                <w:b/>
+                <w:bCs/>
                 <w:sz w:val="24"/>
               </w:rPr>
               <w:t xml:space="preserve">Assessment </w:t>
             </w:r>
             <w:r>
               <w:rPr>
+                <w:rFonts w:ascii="Segoe UI" w:hAnsi="Segoe UI" w:cs="Segoe UI"/>
+                <w:b/>
+                <w:bCs/>
                 <w:spacing w:val="-2"/>
                 <w:sz w:val="24"/>
               </w:rPr>
@@ -295,17 +349,20 @@
             <w:pPr>
               <w:pStyle w:val="TableParagraph"/>
               <w:rPr>
-                <w:sz w:val="24"/>
-              </w:rPr>
-            </w:pPr>
-            <w:r>
-              <w:rPr>
+                <w:rFonts w:ascii="Segoe UI" w:hAnsi="Segoe UI" w:cs="Segoe UI"/>
+                <w:sz w:val="24"/>
+              </w:rPr>
+            </w:pPr>
+            <w:r>
+              <w:rPr>
+                <w:rFonts w:ascii="Segoe UI" w:hAnsi="Segoe UI" w:cs="Segoe UI"/>
                 <w:sz w:val="24"/>
               </w:rPr>
               <w:t>Pre-</w:t>
             </w:r>
             <w:r>
               <w:rPr>
+                <w:rFonts w:ascii="Segoe UI" w:hAnsi="Segoe UI" w:cs="Segoe UI"/>
                 <w:spacing w:val="-4"/>
                 <w:sz w:val="24"/>
               </w:rPr>
@@ -317,82 +374,69 @@
               <w:pStyle w:val="TableParagraph"/>
               <w:spacing w:before="0" w:line="306" w:lineRule="exact"/>
               <w:rPr>
-                <w:rFonts w:ascii="Avenir Next"/>
-                <w:sz w:val="24"/>
-              </w:rPr>
-            </w:pPr>
-            <w:r>
-              <w:rPr>
-                <w:rFonts w:ascii="Avenir Next"/>
+                <w:rFonts w:ascii="Segoe UI" w:hAnsi="Segoe UI" w:cs="Segoe UI"/>
+                <w:sz w:val="24"/>
+              </w:rPr>
+            </w:pPr>
+            <w:r>
+              <w:rPr>
+                <w:rFonts w:ascii="Segoe UI" w:hAnsi="Segoe UI" w:cs="Segoe UI"/>
                 <w:sz w:val="24"/>
               </w:rPr>
               <w:t>{% if session</w:t>
             </w:r>
             <w:r>
               <w:rPr>
-                <w:rFonts w:ascii="Avenir Next"/>
+                <w:rFonts w:ascii="Segoe UI" w:hAnsi="Segoe UI" w:cs="Segoe UI"/>
                 <w:sz w:val="24"/>
               </w:rPr>
               <w:t>1</w:t>
             </w:r>
             <w:r>
               <w:rPr>
-                <w:rFonts w:ascii="Avenir Next"/>
-                <w:sz w:val="24"/>
-              </w:rPr>
-              <w:t>.is_pba %}</w:t>
-            </w:r>
-            <w:r>
-              <w:rPr>
-                <w:sz w:val="24"/>
-              </w:rPr>
-              <w:t>PBA:</w:t>
-            </w:r>
-            <w:r>
-              <w:rPr>
-                <w:rFonts w:ascii="Avenir Next"/>
+                <w:rFonts w:ascii="Segoe UI" w:hAnsi="Segoe UI" w:cs="Segoe UI"/>
+                <w:sz w:val="24"/>
+              </w:rPr>
+              <w:t xml:space="preserve">.is_pba %}PBA: </w:t>
+            </w:r>
+            <w:r>
+              <w:rPr>
+                <w:rFonts w:ascii="Segoe UI" w:hAnsi="Segoe UI" w:cs="Segoe UI"/>
+                <w:sz w:val="24"/>
+              </w:rPr>
+              <w:t>{% endif %}</w:t>
+            </w:r>
+            <w:r>
+              <w:rPr>
+                <w:rFonts w:ascii="Segoe UI" w:hAnsi="Segoe UI" w:cs="Segoe UI"/>
+                <w:sz w:val="24"/>
+              </w:rPr>
+              <w:t>{{</w:t>
+            </w:r>
+            <w:r>
+              <w:rPr>
+                <w:rFonts w:ascii="Segoe UI" w:hAnsi="Segoe UI" w:cs="Segoe UI"/>
                 <w:sz w:val="24"/>
               </w:rPr>
               <w:t xml:space="preserve"> </w:t>
             </w:r>
             <w:r>
               <w:rPr>
-                <w:rFonts w:ascii="Avenir Next"/>
-                <w:sz w:val="24"/>
-              </w:rPr>
-              <w:t>{% endif %}</w:t>
-            </w:r>
-            <w:r>
-              <w:rPr>
-                <w:rFonts w:ascii="Avenir Next"/>
-                <w:sz w:val="24"/>
-              </w:rPr>
-              <w:t>{{</w:t>
-            </w:r>
-            <w:r>
-              <w:rPr>
-                <w:rFonts w:ascii="Avenir Next"/>
-                <w:sz w:val="24"/>
-              </w:rPr>
-              <w:t xml:space="preserve"> </w:t>
-            </w:r>
-            <w:r>
-              <w:rPr>
-                <w:rFonts w:ascii="Avenir Next"/>
+                <w:rFonts w:ascii="Segoe UI" w:hAnsi="Segoe UI" w:cs="Segoe UI"/>
                 <w:sz w:val="24"/>
               </w:rPr>
               <w:t>session</w:t>
             </w:r>
             <w:r>
               <w:rPr>
-                <w:rFonts w:ascii="Avenir Next"/>
+                <w:rFonts w:ascii="Segoe UI" w:hAnsi="Segoe UI" w:cs="Segoe UI"/>
                 <w:sz w:val="24"/>
               </w:rPr>
               <w:t>1</w:t>
             </w:r>
             <w:r>
               <w:rPr>
-                <w:rFonts w:ascii="Avenir Next"/>
+                <w:rFonts w:ascii="Segoe UI" w:hAnsi="Segoe UI" w:cs="Segoe UI"/>
                 <w:sz w:val="24"/>
               </w:rPr>
               <w:t>.activity }}</w:t>
@@ -409,7 +453,7 @@
               <w:spacing w:before="0"/>
               <w:ind w:left="0"/>
               <w:rPr>
-                <w:rFonts w:ascii="Times New Roman"/>
+                <w:rFonts w:ascii="Segoe UI" w:hAnsi="Segoe UI" w:cs="Segoe UI"/>
                 <w:sz w:val="24"/>
               </w:rPr>
             </w:pPr>
@@ -431,6 +475,7 @@
           <w:p>
             <w:pPr>
               <w:rPr>
+                <w:rFonts w:ascii="Segoe UI" w:hAnsi="Segoe UI" w:cs="Segoe UI"/>
                 <w:sz w:val="2"/>
                 <w:szCs w:val="2"/>
               </w:rPr>
@@ -447,13 +492,13 @@
               <w:pStyle w:val="TableParagraph"/>
               <w:spacing w:line="306" w:lineRule="exact"/>
               <w:rPr>
-                <w:rFonts w:ascii="Avenir Next"/>
-                <w:sz w:val="24"/>
-              </w:rPr>
-            </w:pPr>
-            <w:r>
-              <w:rPr>
-                <w:rFonts w:ascii="Avenir Next"/>
+                <w:rFonts w:ascii="Segoe UI" w:hAnsi="Segoe UI" w:cs="Segoe UI"/>
+                <w:sz w:val="24"/>
+              </w:rPr>
+            </w:pPr>
+            <w:r>
+              <w:rPr>
+                <w:rFonts w:ascii="Segoe UI" w:hAnsi="Segoe UI" w:cs="Segoe UI"/>
                 <w:spacing w:val="-5"/>
                 <w:sz w:val="24"/>
               </w:rPr>
@@ -461,7 +506,7 @@
             </w:r>
             <w:r>
               <w:rPr>
-                <w:rFonts w:ascii="Avenir Next"/>
+                <w:rFonts w:ascii="Segoe UI" w:hAnsi="Segoe UI" w:cs="Segoe UI"/>
                 <w:spacing w:val="-5"/>
                 <w:sz w:val="24"/>
               </w:rPr>
@@ -469,7 +514,7 @@
             </w:r>
             <w:r>
               <w:rPr>
-                <w:rFonts w:ascii="Avenir Next"/>
+                <w:rFonts w:ascii="Segoe UI" w:hAnsi="Segoe UI" w:cs="Segoe UI"/>
                 <w:spacing w:val="-5"/>
                 <w:sz w:val="24"/>
               </w:rPr>
@@ -483,6 +528,7 @@
       <w:pPr>
         <w:pStyle w:val="BodyText"/>
         <w:rPr>
+          <w:rFonts w:ascii="Segoe UI" w:hAnsi="Segoe UI" w:cs="Segoe UI"/>
           <w:sz w:val="11"/>
           <w:szCs w:val="16"/>
         </w:rPr>
@@ -524,17 +570,26 @@
             <w:pPr>
               <w:pStyle w:val="TableParagraph"/>
               <w:rPr>
-                <w:sz w:val="24"/>
-              </w:rPr>
-            </w:pPr>
-            <w:r>
-              <w:rPr>
+                <w:rFonts w:ascii="Segoe UI" w:hAnsi="Segoe UI" w:cs="Segoe UI"/>
+                <w:b/>
+                <w:bCs/>
+                <w:sz w:val="24"/>
+              </w:rPr>
+            </w:pPr>
+            <w:r>
+              <w:rPr>
+                <w:rFonts w:ascii="Segoe UI" w:hAnsi="Segoe UI" w:cs="Segoe UI"/>
+                <w:b/>
+                <w:bCs/>
                 <w:sz w:val="24"/>
               </w:rPr>
               <w:t xml:space="preserve">Session </w:t>
             </w:r>
             <w:r>
               <w:rPr>
+                <w:rFonts w:ascii="Segoe UI" w:hAnsi="Segoe UI" w:cs="Segoe UI"/>
+                <w:b/>
+                <w:bCs/>
                 <w:spacing w:val="-5"/>
                 <w:sz w:val="24"/>
               </w:rPr>
@@ -551,17 +606,26 @@
             <w:pPr>
               <w:pStyle w:val="TableParagraph"/>
               <w:rPr>
-                <w:sz w:val="24"/>
-              </w:rPr>
-            </w:pPr>
-            <w:r>
-              <w:rPr>
+                <w:rFonts w:ascii="Segoe UI" w:hAnsi="Segoe UI" w:cs="Segoe UI"/>
+                <w:b/>
+                <w:bCs/>
+                <w:sz w:val="24"/>
+              </w:rPr>
+            </w:pPr>
+            <w:r>
+              <w:rPr>
+                <w:rFonts w:ascii="Segoe UI" w:hAnsi="Segoe UI" w:cs="Segoe UI"/>
+                <w:b/>
+                <w:bCs/>
                 <w:sz w:val="24"/>
               </w:rPr>
               <w:t xml:space="preserve">Assessment </w:t>
             </w:r>
             <w:r>
               <w:rPr>
+                <w:rFonts w:ascii="Segoe UI" w:hAnsi="Segoe UI" w:cs="Segoe UI"/>
+                <w:b/>
+                <w:bCs/>
                 <w:spacing w:val="-2"/>
                 <w:sz w:val="24"/>
               </w:rPr>
@@ -584,11 +648,13 @@
             <w:pPr>
               <w:pStyle w:val="TableParagraph"/>
               <w:rPr>
-                <w:sz w:val="24"/>
-              </w:rPr>
-            </w:pPr>
-            <w:r>
-              <w:rPr>
+                <w:rFonts w:ascii="Segoe UI" w:hAnsi="Segoe UI" w:cs="Segoe UI"/>
+                <w:sz w:val="24"/>
+              </w:rPr>
+            </w:pPr>
+            <w:r>
+              <w:rPr>
+                <w:rFonts w:ascii="Segoe UI" w:hAnsi="Segoe UI" w:cs="Segoe UI"/>
                 <w:spacing w:val="-5"/>
                 <w:sz w:val="24"/>
               </w:rPr>
@@ -600,68 +666,55 @@
               <w:pStyle w:val="TableParagraph"/>
               <w:spacing w:before="0" w:line="306" w:lineRule="exact"/>
               <w:rPr>
-                <w:rFonts w:ascii="Avenir Next"/>
-                <w:sz w:val="24"/>
-              </w:rPr>
-            </w:pPr>
-            <w:r>
-              <w:rPr>
-                <w:rFonts w:ascii="Avenir Next"/>
+                <w:rFonts w:ascii="Segoe UI" w:hAnsi="Segoe UI" w:cs="Segoe UI"/>
+                <w:sz w:val="24"/>
+              </w:rPr>
+            </w:pPr>
+            <w:r>
+              <w:rPr>
+                <w:rFonts w:ascii="Segoe UI" w:hAnsi="Segoe UI" w:cs="Segoe UI"/>
                 <w:sz w:val="24"/>
               </w:rPr>
               <w:t>{% if session</w:t>
             </w:r>
             <w:r>
               <w:rPr>
-                <w:rFonts w:ascii="Avenir Next"/>
+                <w:rFonts w:ascii="Segoe UI" w:hAnsi="Segoe UI" w:cs="Segoe UI"/>
                 <w:sz w:val="24"/>
               </w:rPr>
               <w:t>2</w:t>
             </w:r>
             <w:r>
               <w:rPr>
-                <w:rFonts w:ascii="Avenir Next"/>
-                <w:sz w:val="24"/>
-              </w:rPr>
-              <w:t>.is_pba %}</w:t>
-            </w:r>
-            <w:r>
-              <w:rPr>
-                <w:sz w:val="24"/>
-              </w:rPr>
-              <w:t>PBA:</w:t>
-            </w:r>
-            <w:r>
-              <w:rPr>
-                <w:rFonts w:ascii="Avenir Next"/>
-                <w:sz w:val="24"/>
-              </w:rPr>
-              <w:t xml:space="preserve"> {% endif %}{{</w:t>
-            </w:r>
-            <w:r>
-              <w:rPr>
-                <w:rFonts w:ascii="Avenir Next"/>
+                <w:rFonts w:ascii="Segoe UI" w:hAnsi="Segoe UI" w:cs="Segoe UI"/>
+                <w:sz w:val="24"/>
+              </w:rPr>
+              <w:t>.is_pba %}PBA: {% endif %}{{</w:t>
+            </w:r>
+            <w:r>
+              <w:rPr>
+                <w:rFonts w:ascii="Segoe UI" w:hAnsi="Segoe UI" w:cs="Segoe UI"/>
                 <w:sz w:val="24"/>
               </w:rPr>
               <w:t xml:space="preserve"> </w:t>
             </w:r>
             <w:r>
               <w:rPr>
-                <w:rFonts w:ascii="Avenir Next"/>
+                <w:rFonts w:ascii="Segoe UI" w:hAnsi="Segoe UI" w:cs="Segoe UI"/>
                 <w:sz w:val="24"/>
               </w:rPr>
               <w:t>session</w:t>
             </w:r>
             <w:r>
               <w:rPr>
-                <w:rFonts w:ascii="Avenir Next"/>
+                <w:rFonts w:ascii="Segoe UI" w:hAnsi="Segoe UI" w:cs="Segoe UI"/>
                 <w:sz w:val="24"/>
               </w:rPr>
               <w:t>2</w:t>
             </w:r>
             <w:r>
               <w:rPr>
-                <w:rFonts w:ascii="Avenir Next"/>
+                <w:rFonts w:ascii="Segoe UI" w:hAnsi="Segoe UI" w:cs="Segoe UI"/>
                 <w:sz w:val="24"/>
               </w:rPr>
               <w:t>.activity }}</w:t>
@@ -678,7 +731,7 @@
               <w:spacing w:before="0"/>
               <w:ind w:left="0"/>
               <w:rPr>
-                <w:rFonts w:ascii="Times New Roman"/>
+                <w:rFonts w:ascii="Segoe UI" w:hAnsi="Segoe UI" w:cs="Segoe UI"/>
                 <w:sz w:val="24"/>
               </w:rPr>
             </w:pPr>
@@ -700,6 +753,7 @@
           <w:p>
             <w:pPr>
               <w:rPr>
+                <w:rFonts w:ascii="Segoe UI" w:hAnsi="Segoe UI" w:cs="Segoe UI"/>
                 <w:sz w:val="2"/>
                 <w:szCs w:val="2"/>
               </w:rPr>
@@ -716,13 +770,13 @@
               <w:pStyle w:val="TableParagraph"/>
               <w:spacing w:line="306" w:lineRule="exact"/>
               <w:rPr>
-                <w:rFonts w:ascii="Avenir Next"/>
-                <w:sz w:val="24"/>
-              </w:rPr>
-            </w:pPr>
-            <w:r>
-              <w:rPr>
-                <w:rFonts w:ascii="Avenir Next"/>
+                <w:rFonts w:ascii="Segoe UI" w:hAnsi="Segoe UI" w:cs="Segoe UI"/>
+                <w:sz w:val="24"/>
+              </w:rPr>
+            </w:pPr>
+            <w:r>
+              <w:rPr>
+                <w:rFonts w:ascii="Segoe UI" w:hAnsi="Segoe UI" w:cs="Segoe UI"/>
                 <w:spacing w:val="-5"/>
                 <w:sz w:val="24"/>
               </w:rPr>
@@ -730,7 +784,7 @@
             </w:r>
             <w:r>
               <w:rPr>
-                <w:rFonts w:ascii="Avenir Next"/>
+                <w:rFonts w:ascii="Segoe UI" w:hAnsi="Segoe UI" w:cs="Segoe UI"/>
                 <w:spacing w:val="-5"/>
                 <w:sz w:val="24"/>
               </w:rPr>
@@ -738,7 +792,7 @@
             </w:r>
             <w:r>
               <w:rPr>
-                <w:rFonts w:ascii="Avenir Next"/>
+                <w:rFonts w:ascii="Segoe UI" w:hAnsi="Segoe UI" w:cs="Segoe UI"/>
                 <w:spacing w:val="-5"/>
                 <w:sz w:val="24"/>
               </w:rPr>
@@ -753,6 +807,7 @@
         <w:pStyle w:val="BodyText"/>
         <w:spacing w:before="140"/>
         <w:rPr>
+          <w:rFonts w:ascii="Segoe UI" w:hAnsi="Segoe UI" w:cs="Segoe UI"/>
           <w:sz w:val="11"/>
           <w:szCs w:val="16"/>
         </w:rPr>
@@ -794,17 +849,26 @@
             <w:pPr>
               <w:pStyle w:val="TableParagraph"/>
               <w:rPr>
-                <w:sz w:val="24"/>
-              </w:rPr>
-            </w:pPr>
-            <w:r>
-              <w:rPr>
+                <w:rFonts w:ascii="Segoe UI" w:hAnsi="Segoe UI" w:cs="Segoe UI"/>
+                <w:b/>
+                <w:bCs/>
+                <w:sz w:val="24"/>
+              </w:rPr>
+            </w:pPr>
+            <w:r>
+              <w:rPr>
+                <w:rFonts w:ascii="Segoe UI" w:hAnsi="Segoe UI" w:cs="Segoe UI"/>
+                <w:b/>
+                <w:bCs/>
                 <w:sz w:val="24"/>
               </w:rPr>
               <w:t xml:space="preserve">Session </w:t>
             </w:r>
             <w:r>
               <w:rPr>
+                <w:rFonts w:ascii="Segoe UI" w:hAnsi="Segoe UI" w:cs="Segoe UI"/>
+                <w:b/>
+                <w:bCs/>
                 <w:spacing w:val="-5"/>
                 <w:sz w:val="24"/>
               </w:rPr>
@@ -821,17 +885,26 @@
             <w:pPr>
               <w:pStyle w:val="TableParagraph"/>
               <w:rPr>
-                <w:sz w:val="24"/>
-              </w:rPr>
-            </w:pPr>
-            <w:r>
-              <w:rPr>
+                <w:rFonts w:ascii="Segoe UI" w:hAnsi="Segoe UI" w:cs="Segoe UI"/>
+                <w:b/>
+                <w:bCs/>
+                <w:sz w:val="24"/>
+              </w:rPr>
+            </w:pPr>
+            <w:r>
+              <w:rPr>
+                <w:rFonts w:ascii="Segoe UI" w:hAnsi="Segoe UI" w:cs="Segoe UI"/>
+                <w:b/>
+                <w:bCs/>
                 <w:sz w:val="24"/>
               </w:rPr>
               <w:t xml:space="preserve">Assessment </w:t>
             </w:r>
             <w:r>
               <w:rPr>
+                <w:rFonts w:ascii="Segoe UI" w:hAnsi="Segoe UI" w:cs="Segoe UI"/>
+                <w:b/>
+                <w:bCs/>
                 <w:spacing w:val="-2"/>
                 <w:sz w:val="24"/>
               </w:rPr>
@@ -854,11 +927,13 @@
             <w:pPr>
               <w:pStyle w:val="TableParagraph"/>
               <w:rPr>
-                <w:sz w:val="24"/>
-              </w:rPr>
-            </w:pPr>
-            <w:r>
-              <w:rPr>
+                <w:rFonts w:ascii="Segoe UI" w:hAnsi="Segoe UI" w:cs="Segoe UI"/>
+                <w:sz w:val="24"/>
+              </w:rPr>
+            </w:pPr>
+            <w:r>
+              <w:rPr>
+                <w:rFonts w:ascii="Segoe UI" w:hAnsi="Segoe UI" w:cs="Segoe UI"/>
                 <w:spacing w:val="-5"/>
                 <w:sz w:val="24"/>
               </w:rPr>
@@ -870,68 +945,55 @@
               <w:pStyle w:val="TableParagraph"/>
               <w:spacing w:before="0" w:line="306" w:lineRule="exact"/>
               <w:rPr>
-                <w:rFonts w:ascii="Avenir Next"/>
-                <w:sz w:val="24"/>
-              </w:rPr>
-            </w:pPr>
-            <w:r>
-              <w:rPr>
-                <w:rFonts w:ascii="Avenir Next"/>
+                <w:rFonts w:ascii="Segoe UI" w:hAnsi="Segoe UI" w:cs="Segoe UI"/>
+                <w:sz w:val="24"/>
+              </w:rPr>
+            </w:pPr>
+            <w:r>
+              <w:rPr>
+                <w:rFonts w:ascii="Segoe UI" w:hAnsi="Segoe UI" w:cs="Segoe UI"/>
                 <w:sz w:val="24"/>
               </w:rPr>
               <w:t>{% if session</w:t>
             </w:r>
             <w:r>
               <w:rPr>
-                <w:rFonts w:ascii="Avenir Next"/>
+                <w:rFonts w:ascii="Segoe UI" w:hAnsi="Segoe UI" w:cs="Segoe UI"/>
                 <w:sz w:val="24"/>
               </w:rPr>
               <w:t>3</w:t>
             </w:r>
             <w:r>
               <w:rPr>
-                <w:rFonts w:ascii="Avenir Next"/>
-                <w:sz w:val="24"/>
-              </w:rPr>
-              <w:t>.is_pba %}</w:t>
-            </w:r>
-            <w:r>
-              <w:rPr>
-                <w:sz w:val="24"/>
-              </w:rPr>
-              <w:t>PBA:</w:t>
-            </w:r>
-            <w:r>
-              <w:rPr>
-                <w:rFonts w:ascii="Avenir Next"/>
-                <w:sz w:val="24"/>
-              </w:rPr>
-              <w:t xml:space="preserve"> {% endif %}{{</w:t>
-            </w:r>
-            <w:r>
-              <w:rPr>
-                <w:rFonts w:ascii="Avenir Next"/>
+                <w:rFonts w:ascii="Segoe UI" w:hAnsi="Segoe UI" w:cs="Segoe UI"/>
+                <w:sz w:val="24"/>
+              </w:rPr>
+              <w:t>.is_pba %}PBA: {% endif %}{{</w:t>
+            </w:r>
+            <w:r>
+              <w:rPr>
+                <w:rFonts w:ascii="Segoe UI" w:hAnsi="Segoe UI" w:cs="Segoe UI"/>
                 <w:sz w:val="24"/>
               </w:rPr>
               <w:t xml:space="preserve"> </w:t>
             </w:r>
             <w:r>
               <w:rPr>
-                <w:rFonts w:ascii="Avenir Next"/>
+                <w:rFonts w:ascii="Segoe UI" w:hAnsi="Segoe UI" w:cs="Segoe UI"/>
                 <w:sz w:val="24"/>
               </w:rPr>
               <w:t>session</w:t>
             </w:r>
             <w:r>
               <w:rPr>
-                <w:rFonts w:ascii="Avenir Next"/>
+                <w:rFonts w:ascii="Segoe UI" w:hAnsi="Segoe UI" w:cs="Segoe UI"/>
                 <w:sz w:val="24"/>
               </w:rPr>
               <w:t>3</w:t>
             </w:r>
             <w:r>
               <w:rPr>
-                <w:rFonts w:ascii="Avenir Next"/>
+                <w:rFonts w:ascii="Segoe UI" w:hAnsi="Segoe UI" w:cs="Segoe UI"/>
                 <w:sz w:val="24"/>
               </w:rPr>
               <w:t>.activity }}</w:t>
@@ -948,7 +1010,7 @@
               <w:spacing w:before="0"/>
               <w:ind w:left="0"/>
               <w:rPr>
-                <w:rFonts w:ascii="Times New Roman"/>
+                <w:rFonts w:ascii="Segoe UI" w:hAnsi="Segoe UI" w:cs="Segoe UI"/>
                 <w:sz w:val="24"/>
               </w:rPr>
             </w:pPr>
@@ -970,6 +1032,7 @@
           <w:p>
             <w:pPr>
               <w:rPr>
+                <w:rFonts w:ascii="Segoe UI" w:hAnsi="Segoe UI" w:cs="Segoe UI"/>
                 <w:sz w:val="2"/>
                 <w:szCs w:val="2"/>
               </w:rPr>
@@ -986,13 +1049,13 @@
               <w:pStyle w:val="TableParagraph"/>
               <w:spacing w:line="306" w:lineRule="exact"/>
               <w:rPr>
-                <w:rFonts w:ascii="Avenir Next"/>
-                <w:sz w:val="24"/>
-              </w:rPr>
-            </w:pPr>
-            <w:r>
-              <w:rPr>
-                <w:rFonts w:ascii="Avenir Next"/>
+                <w:rFonts w:ascii="Segoe UI" w:hAnsi="Segoe UI" w:cs="Segoe UI"/>
+                <w:sz w:val="24"/>
+              </w:rPr>
+            </w:pPr>
+            <w:r>
+              <w:rPr>
+                <w:rFonts w:ascii="Segoe UI" w:hAnsi="Segoe UI" w:cs="Segoe UI"/>
                 <w:spacing w:val="-5"/>
                 <w:sz w:val="24"/>
               </w:rPr>
@@ -1000,7 +1063,7 @@
             </w:r>
             <w:r>
               <w:rPr>
-                <w:rFonts w:ascii="Avenir Next"/>
+                <w:rFonts w:ascii="Segoe UI" w:hAnsi="Segoe UI" w:cs="Segoe UI"/>
                 <w:spacing w:val="-5"/>
                 <w:sz w:val="24"/>
               </w:rPr>
@@ -1008,7 +1071,7 @@
             </w:r>
             <w:r>
               <w:rPr>
-                <w:rFonts w:ascii="Avenir Next"/>
+                <w:rFonts w:ascii="Segoe UI" w:hAnsi="Segoe UI" w:cs="Segoe UI"/>
                 <w:spacing w:val="-5"/>
                 <w:sz w:val="24"/>
               </w:rPr>
@@ -1022,6 +1085,7 @@
       <w:pPr>
         <w:pStyle w:val="BodyText"/>
         <w:rPr>
+          <w:rFonts w:ascii="Segoe UI" w:hAnsi="Segoe UI" w:cs="Segoe UI"/>
           <w:sz w:val="11"/>
           <w:szCs w:val="16"/>
         </w:rPr>
@@ -1063,17 +1127,26 @@
             <w:pPr>
               <w:pStyle w:val="TableParagraph"/>
               <w:rPr>
-                <w:sz w:val="24"/>
-              </w:rPr>
-            </w:pPr>
-            <w:r>
-              <w:rPr>
+                <w:rFonts w:ascii="Segoe UI" w:hAnsi="Segoe UI" w:cs="Segoe UI"/>
+                <w:b/>
+                <w:bCs/>
+                <w:sz w:val="24"/>
+              </w:rPr>
+            </w:pPr>
+            <w:r>
+              <w:rPr>
+                <w:rFonts w:ascii="Segoe UI" w:hAnsi="Segoe UI" w:cs="Segoe UI"/>
+                <w:b/>
+                <w:bCs/>
                 <w:sz w:val="24"/>
               </w:rPr>
               <w:t xml:space="preserve">Session </w:t>
             </w:r>
             <w:r>
               <w:rPr>
+                <w:rFonts w:ascii="Segoe UI" w:hAnsi="Segoe UI" w:cs="Segoe UI"/>
+                <w:b/>
+                <w:bCs/>
                 <w:spacing w:val="-5"/>
                 <w:sz w:val="24"/>
               </w:rPr>
@@ -1090,17 +1163,26 @@
             <w:pPr>
               <w:pStyle w:val="TableParagraph"/>
               <w:rPr>
-                <w:sz w:val="24"/>
-              </w:rPr>
-            </w:pPr>
-            <w:r>
-              <w:rPr>
+                <w:rFonts w:ascii="Segoe UI" w:hAnsi="Segoe UI" w:cs="Segoe UI"/>
+                <w:b/>
+                <w:bCs/>
+                <w:sz w:val="24"/>
+              </w:rPr>
+            </w:pPr>
+            <w:r>
+              <w:rPr>
+                <w:rFonts w:ascii="Segoe UI" w:hAnsi="Segoe UI" w:cs="Segoe UI"/>
+                <w:b/>
+                <w:bCs/>
                 <w:sz w:val="24"/>
               </w:rPr>
               <w:t xml:space="preserve">Assessment </w:t>
             </w:r>
             <w:r>
               <w:rPr>
+                <w:rFonts w:ascii="Segoe UI" w:hAnsi="Segoe UI" w:cs="Segoe UI"/>
+                <w:b/>
+                <w:bCs/>
                 <w:spacing w:val="-2"/>
                 <w:sz w:val="24"/>
               </w:rPr>
@@ -1123,11 +1205,13 @@
             <w:pPr>
               <w:pStyle w:val="TableParagraph"/>
               <w:rPr>
-                <w:sz w:val="24"/>
-              </w:rPr>
-            </w:pPr>
-            <w:r>
-              <w:rPr>
+                <w:rFonts w:ascii="Segoe UI" w:hAnsi="Segoe UI" w:cs="Segoe UI"/>
+                <w:sz w:val="24"/>
+              </w:rPr>
+            </w:pPr>
+            <w:r>
+              <w:rPr>
+                <w:rFonts w:ascii="Segoe UI" w:hAnsi="Segoe UI" w:cs="Segoe UI"/>
                 <w:spacing w:val="-5"/>
                 <w:sz w:val="24"/>
               </w:rPr>
@@ -1139,68 +1223,55 @@
               <w:pStyle w:val="TableParagraph"/>
               <w:spacing w:before="0" w:line="306" w:lineRule="exact"/>
               <w:rPr>
-                <w:rFonts w:ascii="Avenir Next"/>
-                <w:sz w:val="24"/>
-              </w:rPr>
-            </w:pPr>
-            <w:r>
-              <w:rPr>
-                <w:rFonts w:ascii="Avenir Next"/>
+                <w:rFonts w:ascii="Segoe UI" w:hAnsi="Segoe UI" w:cs="Segoe UI"/>
+                <w:sz w:val="24"/>
+              </w:rPr>
+            </w:pPr>
+            <w:r>
+              <w:rPr>
+                <w:rFonts w:ascii="Segoe UI" w:hAnsi="Segoe UI" w:cs="Segoe UI"/>
                 <w:sz w:val="24"/>
               </w:rPr>
               <w:t>{% if session</w:t>
             </w:r>
             <w:r>
               <w:rPr>
-                <w:rFonts w:ascii="Avenir Next"/>
+                <w:rFonts w:ascii="Segoe UI" w:hAnsi="Segoe UI" w:cs="Segoe UI"/>
                 <w:sz w:val="24"/>
               </w:rPr>
               <w:t>4</w:t>
             </w:r>
             <w:r>
               <w:rPr>
-                <w:rFonts w:ascii="Avenir Next"/>
-                <w:sz w:val="24"/>
-              </w:rPr>
-              <w:t>.is_pba %}</w:t>
-            </w:r>
-            <w:r>
-              <w:rPr>
-                <w:sz w:val="24"/>
-              </w:rPr>
-              <w:t>PBA:</w:t>
-            </w:r>
-            <w:r>
-              <w:rPr>
-                <w:rFonts w:ascii="Avenir Next"/>
-                <w:sz w:val="24"/>
-              </w:rPr>
-              <w:t xml:space="preserve"> {% endif %}{{</w:t>
-            </w:r>
-            <w:r>
-              <w:rPr>
-                <w:rFonts w:ascii="Avenir Next"/>
+                <w:rFonts w:ascii="Segoe UI" w:hAnsi="Segoe UI" w:cs="Segoe UI"/>
+                <w:sz w:val="24"/>
+              </w:rPr>
+              <w:t>.is_pba %}PBA: {% endif %}{{</w:t>
+            </w:r>
+            <w:r>
+              <w:rPr>
+                <w:rFonts w:ascii="Segoe UI" w:hAnsi="Segoe UI" w:cs="Segoe UI"/>
                 <w:sz w:val="24"/>
               </w:rPr>
               <w:t xml:space="preserve"> </w:t>
             </w:r>
             <w:r>
               <w:rPr>
-                <w:rFonts w:ascii="Avenir Next"/>
+                <w:rFonts w:ascii="Segoe UI" w:hAnsi="Segoe UI" w:cs="Segoe UI"/>
                 <w:sz w:val="24"/>
               </w:rPr>
               <w:t>session</w:t>
             </w:r>
             <w:r>
               <w:rPr>
-                <w:rFonts w:ascii="Avenir Next"/>
+                <w:rFonts w:ascii="Segoe UI" w:hAnsi="Segoe UI" w:cs="Segoe UI"/>
                 <w:sz w:val="24"/>
               </w:rPr>
               <w:t>4</w:t>
             </w:r>
             <w:r>
               <w:rPr>
-                <w:rFonts w:ascii="Avenir Next"/>
+                <w:rFonts w:ascii="Segoe UI" w:hAnsi="Segoe UI" w:cs="Segoe UI"/>
                 <w:sz w:val="24"/>
               </w:rPr>
               <w:t>.activity }}</w:t>
@@ -1217,7 +1288,7 @@
               <w:spacing w:before="0"/>
               <w:ind w:left="0"/>
               <w:rPr>
-                <w:rFonts w:ascii="Times New Roman"/>
+                <w:rFonts w:ascii="Segoe UI" w:hAnsi="Segoe UI" w:cs="Segoe UI"/>
                 <w:sz w:val="24"/>
               </w:rPr>
             </w:pPr>
@@ -1239,6 +1310,7 @@
           <w:p>
             <w:pPr>
               <w:rPr>
+                <w:rFonts w:ascii="Segoe UI" w:hAnsi="Segoe UI" w:cs="Segoe UI"/>
                 <w:sz w:val="2"/>
                 <w:szCs w:val="2"/>
               </w:rPr>
@@ -1256,13 +1328,13 @@
               <w:spacing w:before="0"/>
               <w:ind w:left="72"/>
               <w:rPr>
-                <w:rFonts w:ascii="Times New Roman"/>
-                <w:sz w:val="24"/>
-              </w:rPr>
-            </w:pPr>
-            <w:r>
-              <w:rPr>
-                <w:rFonts w:ascii="Avenir Next"/>
+                <w:rFonts w:ascii="Segoe UI" w:hAnsi="Segoe UI" w:cs="Segoe UI"/>
+                <w:sz w:val="24"/>
+              </w:rPr>
+            </w:pPr>
+            <w:r>
+              <w:rPr>
+                <w:rFonts w:ascii="Segoe UI" w:hAnsi="Segoe UI" w:cs="Segoe UI"/>
                 <w:spacing w:val="-5"/>
                 <w:sz w:val="24"/>
               </w:rPr>
@@ -1270,7 +1342,7 @@
             </w:r>
             <w:r>
               <w:rPr>
-                <w:rFonts w:ascii="Avenir Next"/>
+                <w:rFonts w:ascii="Segoe UI" w:hAnsi="Segoe UI" w:cs="Segoe UI"/>
                 <w:spacing w:val="-5"/>
                 <w:sz w:val="24"/>
               </w:rPr>
@@ -1278,7 +1350,7 @@
             </w:r>
             <w:r>
               <w:rPr>
-                <w:rFonts w:ascii="Avenir Next"/>
+                <w:rFonts w:ascii="Segoe UI" w:hAnsi="Segoe UI" w:cs="Segoe UI"/>
                 <w:spacing w:val="-5"/>
                 <w:sz w:val="24"/>
               </w:rPr>
@@ -1293,6 +1365,7 @@
         <w:pStyle w:val="BodyText"/>
         <w:spacing w:before="135"/>
         <w:rPr>
+          <w:rFonts w:ascii="Segoe UI" w:hAnsi="Segoe UI" w:cs="Segoe UI"/>
           <w:sz w:val="11"/>
           <w:szCs w:val="16"/>
         </w:rPr>
@@ -1334,17 +1407,26 @@
             <w:pPr>
               <w:pStyle w:val="TableParagraph"/>
               <w:rPr>
-                <w:sz w:val="24"/>
-              </w:rPr>
-            </w:pPr>
-            <w:r>
-              <w:rPr>
+                <w:rFonts w:ascii="Segoe UI" w:hAnsi="Segoe UI" w:cs="Segoe UI"/>
+                <w:b/>
+                <w:bCs/>
+                <w:sz w:val="24"/>
+              </w:rPr>
+            </w:pPr>
+            <w:r>
+              <w:rPr>
+                <w:rFonts w:ascii="Segoe UI" w:hAnsi="Segoe UI" w:cs="Segoe UI"/>
+                <w:b/>
+                <w:bCs/>
                 <w:sz w:val="24"/>
               </w:rPr>
               <w:t xml:space="preserve">Session </w:t>
             </w:r>
             <w:r>
               <w:rPr>
+                <w:rFonts w:ascii="Segoe UI" w:hAnsi="Segoe UI" w:cs="Segoe UI"/>
+                <w:b/>
+                <w:bCs/>
                 <w:spacing w:val="-5"/>
                 <w:sz w:val="24"/>
               </w:rPr>
@@ -1361,17 +1443,26 @@
             <w:pPr>
               <w:pStyle w:val="TableParagraph"/>
               <w:rPr>
-                <w:sz w:val="24"/>
-              </w:rPr>
-            </w:pPr>
-            <w:r>
-              <w:rPr>
+                <w:rFonts w:ascii="Segoe UI" w:hAnsi="Segoe UI" w:cs="Segoe UI"/>
+                <w:b/>
+                <w:bCs/>
+                <w:sz w:val="24"/>
+              </w:rPr>
+            </w:pPr>
+            <w:r>
+              <w:rPr>
+                <w:rFonts w:ascii="Segoe UI" w:hAnsi="Segoe UI" w:cs="Segoe UI"/>
+                <w:b/>
+                <w:bCs/>
                 <w:sz w:val="24"/>
               </w:rPr>
               <w:t xml:space="preserve">Assessment </w:t>
             </w:r>
             <w:r>
               <w:rPr>
+                <w:rFonts w:ascii="Segoe UI" w:hAnsi="Segoe UI" w:cs="Segoe UI"/>
+                <w:b/>
+                <w:bCs/>
                 <w:spacing w:val="-2"/>
                 <w:sz w:val="24"/>
               </w:rPr>
@@ -1394,11 +1485,13 @@
             <w:pPr>
               <w:pStyle w:val="TableParagraph"/>
               <w:rPr>
-                <w:sz w:val="24"/>
-              </w:rPr>
-            </w:pPr>
-            <w:r>
-              <w:rPr>
+                <w:rFonts w:ascii="Segoe UI" w:hAnsi="Segoe UI" w:cs="Segoe UI"/>
+                <w:sz w:val="24"/>
+              </w:rPr>
+            </w:pPr>
+            <w:r>
+              <w:rPr>
+                <w:rFonts w:ascii="Segoe UI" w:hAnsi="Segoe UI" w:cs="Segoe UI"/>
                 <w:spacing w:val="-5"/>
                 <w:sz w:val="24"/>
               </w:rPr>
@@ -1410,68 +1503,55 @@
               <w:pStyle w:val="TableParagraph"/>
               <w:spacing w:before="0" w:line="306" w:lineRule="exact"/>
               <w:rPr>
-                <w:rFonts w:ascii="Avenir Next"/>
-                <w:sz w:val="24"/>
-              </w:rPr>
-            </w:pPr>
-            <w:r>
-              <w:rPr>
-                <w:rFonts w:ascii="Avenir Next"/>
+                <w:rFonts w:ascii="Segoe UI" w:hAnsi="Segoe UI" w:cs="Segoe UI"/>
+                <w:sz w:val="24"/>
+              </w:rPr>
+            </w:pPr>
+            <w:r>
+              <w:rPr>
+                <w:rFonts w:ascii="Segoe UI" w:hAnsi="Segoe UI" w:cs="Segoe UI"/>
                 <w:sz w:val="24"/>
               </w:rPr>
               <w:t>{% if session</w:t>
             </w:r>
             <w:r>
               <w:rPr>
-                <w:rFonts w:ascii="Avenir Next"/>
+                <w:rFonts w:ascii="Segoe UI" w:hAnsi="Segoe UI" w:cs="Segoe UI"/>
                 <w:sz w:val="24"/>
               </w:rPr>
               <w:t>5</w:t>
             </w:r>
             <w:r>
               <w:rPr>
-                <w:rFonts w:ascii="Avenir Next"/>
-                <w:sz w:val="24"/>
-              </w:rPr>
-              <w:t>.is_pba %}</w:t>
-            </w:r>
-            <w:r>
-              <w:rPr>
-                <w:sz w:val="24"/>
-              </w:rPr>
-              <w:t>PBA:</w:t>
-            </w:r>
-            <w:r>
-              <w:rPr>
-                <w:rFonts w:ascii="Avenir Next"/>
-                <w:sz w:val="24"/>
-              </w:rPr>
-              <w:t xml:space="preserve"> {% endif %}{{</w:t>
-            </w:r>
-            <w:r>
-              <w:rPr>
-                <w:rFonts w:ascii="Avenir Next"/>
+                <w:rFonts w:ascii="Segoe UI" w:hAnsi="Segoe UI" w:cs="Segoe UI"/>
+                <w:sz w:val="24"/>
+              </w:rPr>
+              <w:t>.is_pba %}PBA: {% endif %}{{</w:t>
+            </w:r>
+            <w:r>
+              <w:rPr>
+                <w:rFonts w:ascii="Segoe UI" w:hAnsi="Segoe UI" w:cs="Segoe UI"/>
                 <w:sz w:val="24"/>
               </w:rPr>
               <w:t xml:space="preserve"> </w:t>
             </w:r>
             <w:r>
               <w:rPr>
-                <w:rFonts w:ascii="Avenir Next"/>
+                <w:rFonts w:ascii="Segoe UI" w:hAnsi="Segoe UI" w:cs="Segoe UI"/>
                 <w:sz w:val="24"/>
               </w:rPr>
               <w:t>session</w:t>
             </w:r>
             <w:r>
               <w:rPr>
-                <w:rFonts w:ascii="Avenir Next"/>
+                <w:rFonts w:ascii="Segoe UI" w:hAnsi="Segoe UI" w:cs="Segoe UI"/>
                 <w:sz w:val="24"/>
               </w:rPr>
               <w:t>5</w:t>
             </w:r>
             <w:r>
               <w:rPr>
-                <w:rFonts w:ascii="Avenir Next"/>
+                <w:rFonts w:ascii="Segoe UI" w:hAnsi="Segoe UI" w:cs="Segoe UI"/>
                 <w:sz w:val="24"/>
               </w:rPr>
               <w:t>.activity }}</w:t>
@@ -1488,7 +1568,7 @@
               <w:spacing w:before="0"/>
               <w:ind w:left="0"/>
               <w:rPr>
-                <w:rFonts w:ascii="Times New Roman"/>
+                <w:rFonts w:ascii="Segoe UI" w:hAnsi="Segoe UI" w:cs="Segoe UI"/>
                 <w:sz w:val="24"/>
               </w:rPr>
             </w:pPr>
@@ -1510,6 +1590,7 @@
           <w:p>
             <w:pPr>
               <w:rPr>
+                <w:rFonts w:ascii="Segoe UI" w:hAnsi="Segoe UI" w:cs="Segoe UI"/>
                 <w:sz w:val="2"/>
                 <w:szCs w:val="2"/>
               </w:rPr>
@@ -1527,13 +1608,13 @@
               <w:spacing w:before="0"/>
               <w:ind w:left="72"/>
               <w:rPr>
-                <w:rFonts w:ascii="Times New Roman"/>
-                <w:sz w:val="24"/>
-              </w:rPr>
-            </w:pPr>
-            <w:r>
-              <w:rPr>
-                <w:rFonts w:ascii="Avenir Next"/>
+                <w:rFonts w:ascii="Segoe UI" w:hAnsi="Segoe UI" w:cs="Segoe UI"/>
+                <w:sz w:val="24"/>
+              </w:rPr>
+            </w:pPr>
+            <w:r>
+              <w:rPr>
+                <w:rFonts w:ascii="Segoe UI" w:hAnsi="Segoe UI" w:cs="Segoe UI"/>
                 <w:spacing w:val="-5"/>
                 <w:sz w:val="24"/>
               </w:rPr>
@@ -1541,7 +1622,7 @@
             </w:r>
             <w:r>
               <w:rPr>
-                <w:rFonts w:ascii="Avenir Next"/>
+                <w:rFonts w:ascii="Segoe UI" w:hAnsi="Segoe UI" w:cs="Segoe UI"/>
                 <w:spacing w:val="-5"/>
                 <w:sz w:val="24"/>
               </w:rPr>
@@ -1549,7 +1630,7 @@
             </w:r>
             <w:r>
               <w:rPr>
-                <w:rFonts w:ascii="Avenir Next"/>
+                <w:rFonts w:ascii="Segoe UI" w:hAnsi="Segoe UI" w:cs="Segoe UI"/>
                 <w:spacing w:val="-5"/>
                 <w:sz w:val="24"/>
               </w:rPr>
@@ -1563,6 +1644,7 @@
       <w:pPr>
         <w:pStyle w:val="BodyText"/>
         <w:rPr>
+          <w:rFonts w:ascii="Segoe UI" w:hAnsi="Segoe UI" w:cs="Segoe UI"/>
           <w:sz w:val="11"/>
           <w:szCs w:val="16"/>
         </w:rPr>
@@ -1604,17 +1686,26 @@
             <w:pPr>
               <w:pStyle w:val="TableParagraph"/>
               <w:rPr>
-                <w:sz w:val="24"/>
-              </w:rPr>
-            </w:pPr>
-            <w:r>
-              <w:rPr>
+                <w:rFonts w:ascii="Segoe UI" w:hAnsi="Segoe UI" w:cs="Segoe UI"/>
+                <w:b/>
+                <w:bCs/>
+                <w:sz w:val="24"/>
+              </w:rPr>
+            </w:pPr>
+            <w:r>
+              <w:rPr>
+                <w:rFonts w:ascii="Segoe UI" w:hAnsi="Segoe UI" w:cs="Segoe UI"/>
+                <w:b/>
+                <w:bCs/>
                 <w:sz w:val="24"/>
               </w:rPr>
               <w:t xml:space="preserve">Session </w:t>
             </w:r>
             <w:r>
               <w:rPr>
+                <w:rFonts w:ascii="Segoe UI" w:hAnsi="Segoe UI" w:cs="Segoe UI"/>
+                <w:b/>
+                <w:bCs/>
                 <w:spacing w:val="-5"/>
                 <w:sz w:val="24"/>
               </w:rPr>
@@ -1631,17 +1722,26 @@
             <w:pPr>
               <w:pStyle w:val="TableParagraph"/>
               <w:rPr>
-                <w:sz w:val="24"/>
-              </w:rPr>
-            </w:pPr>
-            <w:r>
-              <w:rPr>
+                <w:rFonts w:ascii="Segoe UI" w:hAnsi="Segoe UI" w:cs="Segoe UI"/>
+                <w:b/>
+                <w:bCs/>
+                <w:sz w:val="24"/>
+              </w:rPr>
+            </w:pPr>
+            <w:r>
+              <w:rPr>
+                <w:rFonts w:ascii="Segoe UI" w:hAnsi="Segoe UI" w:cs="Segoe UI"/>
+                <w:b/>
+                <w:bCs/>
                 <w:sz w:val="24"/>
               </w:rPr>
               <w:t xml:space="preserve">Assessment </w:t>
             </w:r>
             <w:r>
               <w:rPr>
+                <w:rFonts w:ascii="Segoe UI" w:hAnsi="Segoe UI" w:cs="Segoe UI"/>
+                <w:b/>
+                <w:bCs/>
                 <w:spacing w:val="-2"/>
                 <w:sz w:val="24"/>
               </w:rPr>
@@ -1665,17 +1765,20 @@
               <w:pStyle w:val="TableParagraph"/>
               <w:spacing w:before="86"/>
               <w:rPr>
-                <w:sz w:val="24"/>
-              </w:rPr>
-            </w:pPr>
-            <w:r>
-              <w:rPr>
+                <w:rFonts w:ascii="Segoe UI" w:hAnsi="Segoe UI" w:cs="Segoe UI"/>
+                <w:sz w:val="24"/>
+              </w:rPr>
+            </w:pPr>
+            <w:r>
+              <w:rPr>
+                <w:rFonts w:ascii="Segoe UI" w:hAnsi="Segoe UI" w:cs="Segoe UI"/>
                 <w:sz w:val="24"/>
               </w:rPr>
               <w:t xml:space="preserve">Test </w:t>
             </w:r>
             <w:r>
               <w:rPr>
+                <w:rFonts w:ascii="Segoe UI" w:hAnsi="Segoe UI" w:cs="Segoe UI"/>
                 <w:spacing w:val="-2"/>
                 <w:sz w:val="24"/>
               </w:rPr>
@@ -1687,54 +1790,41 @@
               <w:pStyle w:val="TableParagraph"/>
               <w:spacing w:before="0" w:line="306" w:lineRule="exact"/>
               <w:rPr>
-                <w:rFonts w:ascii="Avenir Next"/>
-                <w:sz w:val="24"/>
-              </w:rPr>
-            </w:pPr>
-            <w:r>
-              <w:rPr>
-                <w:rFonts w:ascii="Avenir Next"/>
+                <w:rFonts w:ascii="Segoe UI" w:hAnsi="Segoe UI" w:cs="Segoe UI"/>
+                <w:sz w:val="24"/>
+              </w:rPr>
+            </w:pPr>
+            <w:r>
+              <w:rPr>
+                <w:rFonts w:ascii="Segoe UI" w:hAnsi="Segoe UI" w:cs="Segoe UI"/>
                 <w:sz w:val="24"/>
               </w:rPr>
               <w:t>{% if session</w:t>
             </w:r>
             <w:r>
               <w:rPr>
-                <w:rFonts w:ascii="Avenir Next"/>
+                <w:rFonts w:ascii="Segoe UI" w:hAnsi="Segoe UI" w:cs="Segoe UI"/>
                 <w:sz w:val="24"/>
               </w:rPr>
               <w:t>6</w:t>
             </w:r>
             <w:r>
               <w:rPr>
-                <w:rFonts w:ascii="Avenir Next"/>
-                <w:sz w:val="24"/>
-              </w:rPr>
-              <w:t>.is_pba %}</w:t>
-            </w:r>
-            <w:r>
-              <w:rPr>
-                <w:sz w:val="24"/>
-              </w:rPr>
-              <w:t>PBA:</w:t>
-            </w:r>
-            <w:r>
-              <w:rPr>
-                <w:rFonts w:ascii="Avenir Next"/>
-                <w:sz w:val="24"/>
-              </w:rPr>
-              <w:t xml:space="preserve"> {% endif %}{{session</w:t>
-            </w:r>
-            <w:r>
-              <w:rPr>
-                <w:rFonts w:ascii="Avenir Next"/>
+                <w:rFonts w:ascii="Segoe UI" w:hAnsi="Segoe UI" w:cs="Segoe UI"/>
+                <w:sz w:val="24"/>
+              </w:rPr>
+              <w:t>.is_pba %}PBA: {% endif %}{{session</w:t>
+            </w:r>
+            <w:r>
+              <w:rPr>
+                <w:rFonts w:ascii="Segoe UI" w:hAnsi="Segoe UI" w:cs="Segoe UI"/>
                 <w:sz w:val="24"/>
               </w:rPr>
               <w:t>6</w:t>
             </w:r>
             <w:r>
               <w:rPr>
-                <w:rFonts w:ascii="Avenir Next"/>
+                <w:rFonts w:ascii="Segoe UI" w:hAnsi="Segoe UI" w:cs="Segoe UI"/>
                 <w:sz w:val="24"/>
               </w:rPr>
               <w:t>.activity }}</w:t>
@@ -1751,7 +1841,7 @@
               <w:spacing w:before="0"/>
               <w:ind w:left="0"/>
               <w:rPr>
-                <w:rFonts w:ascii="Times New Roman"/>
+                <w:rFonts w:ascii="Segoe UI" w:hAnsi="Segoe UI" w:cs="Segoe UI"/>
                 <w:sz w:val="24"/>
               </w:rPr>
             </w:pPr>
@@ -1773,6 +1863,7 @@
           <w:p>
             <w:pPr>
               <w:rPr>
+                <w:rFonts w:ascii="Segoe UI" w:hAnsi="Segoe UI" w:cs="Segoe UI"/>
                 <w:sz w:val="2"/>
                 <w:szCs w:val="2"/>
               </w:rPr>
@@ -1789,13 +1880,13 @@
               <w:pStyle w:val="TableParagraph"/>
               <w:spacing w:line="306" w:lineRule="exact"/>
               <w:rPr>
-                <w:rFonts w:ascii="Avenir Next"/>
-                <w:sz w:val="24"/>
-              </w:rPr>
-            </w:pPr>
-            <w:r>
-              <w:rPr>
-                <w:rFonts w:ascii="Avenir Next"/>
+                <w:rFonts w:ascii="Segoe UI" w:hAnsi="Segoe UI" w:cs="Segoe UI"/>
+                <w:sz w:val="24"/>
+              </w:rPr>
+            </w:pPr>
+            <w:r>
+              <w:rPr>
+                <w:rFonts w:ascii="Segoe UI" w:hAnsi="Segoe UI" w:cs="Segoe UI"/>
                 <w:spacing w:val="-5"/>
                 <w:sz w:val="24"/>
               </w:rPr>
@@ -1803,7 +1894,7 @@
             </w:r>
             <w:r>
               <w:rPr>
-                <w:rFonts w:ascii="Avenir Next"/>
+                <w:rFonts w:ascii="Segoe UI" w:hAnsi="Segoe UI" w:cs="Segoe UI"/>
                 <w:spacing w:val="-5"/>
                 <w:sz w:val="24"/>
               </w:rPr>
@@ -1811,7 +1902,7 @@
             </w:r>
             <w:r>
               <w:rPr>
-                <w:rFonts w:ascii="Avenir Next"/>
+                <w:rFonts w:ascii="Segoe UI" w:hAnsi="Segoe UI" w:cs="Segoe UI"/>
                 <w:spacing w:val="-5"/>
                 <w:sz w:val="24"/>
               </w:rPr>
@@ -1826,6 +1917,7 @@
         <w:pStyle w:val="BodyText"/>
         <w:spacing w:before="135"/>
         <w:rPr>
+          <w:rFonts w:ascii="Segoe UI" w:hAnsi="Segoe UI" w:cs="Segoe UI"/>
           <w:sz w:val="11"/>
           <w:szCs w:val="16"/>
         </w:rPr>
@@ -1867,17 +1959,26 @@
             <w:pPr>
               <w:pStyle w:val="TableParagraph"/>
               <w:rPr>
-                <w:sz w:val="24"/>
-              </w:rPr>
-            </w:pPr>
-            <w:r>
-              <w:rPr>
+                <w:rFonts w:ascii="Segoe UI" w:hAnsi="Segoe UI" w:cs="Segoe UI"/>
+                <w:b/>
+                <w:bCs/>
+                <w:sz w:val="24"/>
+              </w:rPr>
+            </w:pPr>
+            <w:r>
+              <w:rPr>
+                <w:rFonts w:ascii="Segoe UI" w:hAnsi="Segoe UI" w:cs="Segoe UI"/>
+                <w:b/>
+                <w:bCs/>
                 <w:sz w:val="24"/>
               </w:rPr>
               <w:t xml:space="preserve">Session </w:t>
             </w:r>
             <w:r>
               <w:rPr>
+                <w:rFonts w:ascii="Segoe UI" w:hAnsi="Segoe UI" w:cs="Segoe UI"/>
+                <w:b/>
+                <w:bCs/>
                 <w:spacing w:val="-5"/>
                 <w:sz w:val="24"/>
               </w:rPr>
@@ -1894,17 +1995,26 @@
             <w:pPr>
               <w:pStyle w:val="TableParagraph"/>
               <w:rPr>
-                <w:sz w:val="24"/>
-              </w:rPr>
-            </w:pPr>
-            <w:r>
-              <w:rPr>
+                <w:rFonts w:ascii="Segoe UI" w:hAnsi="Segoe UI" w:cs="Segoe UI"/>
+                <w:b/>
+                <w:bCs/>
+                <w:sz w:val="24"/>
+              </w:rPr>
+            </w:pPr>
+            <w:r>
+              <w:rPr>
+                <w:rFonts w:ascii="Segoe UI" w:hAnsi="Segoe UI" w:cs="Segoe UI"/>
+                <w:b/>
+                <w:bCs/>
                 <w:sz w:val="24"/>
               </w:rPr>
               <w:t xml:space="preserve">Assessment </w:t>
             </w:r>
             <w:r>
               <w:rPr>
+                <w:rFonts w:ascii="Segoe UI" w:hAnsi="Segoe UI" w:cs="Segoe UI"/>
+                <w:b/>
+                <w:bCs/>
                 <w:spacing w:val="-2"/>
                 <w:sz w:val="24"/>
               </w:rPr>
@@ -1927,17 +2037,20 @@
             <w:pPr>
               <w:pStyle w:val="TableParagraph"/>
               <w:rPr>
-                <w:sz w:val="24"/>
-              </w:rPr>
-            </w:pPr>
-            <w:r>
-              <w:rPr>
+                <w:rFonts w:ascii="Segoe UI" w:hAnsi="Segoe UI" w:cs="Segoe UI"/>
+                <w:sz w:val="24"/>
+              </w:rPr>
+            </w:pPr>
+            <w:r>
+              <w:rPr>
+                <w:rFonts w:ascii="Segoe UI" w:hAnsi="Segoe UI" w:cs="Segoe UI"/>
                 <w:sz w:val="24"/>
               </w:rPr>
               <w:t xml:space="preserve">Post </w:t>
             </w:r>
             <w:r>
               <w:rPr>
+                <w:rFonts w:ascii="Segoe UI" w:hAnsi="Segoe UI" w:cs="Segoe UI"/>
                 <w:spacing w:val="-4"/>
                 <w:sz w:val="24"/>
               </w:rPr>
@@ -1949,68 +2062,55 @@
               <w:pStyle w:val="TableParagraph"/>
               <w:spacing w:before="0" w:line="306" w:lineRule="exact"/>
               <w:rPr>
-                <w:rFonts w:ascii="Avenir Next"/>
-                <w:sz w:val="24"/>
-              </w:rPr>
-            </w:pPr>
-            <w:r>
-              <w:rPr>
-                <w:rFonts w:ascii="Avenir Next"/>
+                <w:rFonts w:ascii="Segoe UI" w:hAnsi="Segoe UI" w:cs="Segoe UI"/>
+                <w:sz w:val="24"/>
+              </w:rPr>
+            </w:pPr>
+            <w:r>
+              <w:rPr>
+                <w:rFonts w:ascii="Segoe UI" w:hAnsi="Segoe UI" w:cs="Segoe UI"/>
                 <w:sz w:val="24"/>
               </w:rPr>
               <w:t>{% if session</w:t>
             </w:r>
             <w:r>
               <w:rPr>
-                <w:rFonts w:ascii="Avenir Next"/>
+                <w:rFonts w:ascii="Segoe UI" w:hAnsi="Segoe UI" w:cs="Segoe UI"/>
                 <w:sz w:val="24"/>
               </w:rPr>
               <w:t>7</w:t>
             </w:r>
             <w:r>
               <w:rPr>
-                <w:rFonts w:ascii="Avenir Next"/>
-                <w:sz w:val="24"/>
-              </w:rPr>
-              <w:t>.is_pba %}</w:t>
-            </w:r>
-            <w:r>
-              <w:rPr>
-                <w:sz w:val="24"/>
-              </w:rPr>
-              <w:t>PBA:</w:t>
-            </w:r>
-            <w:r>
-              <w:rPr>
-                <w:rFonts w:ascii="Avenir Next"/>
-                <w:sz w:val="24"/>
-              </w:rPr>
-              <w:t xml:space="preserve"> {% endif %}{{</w:t>
-            </w:r>
-            <w:r>
-              <w:rPr>
-                <w:rFonts w:ascii="Avenir Next"/>
+                <w:rFonts w:ascii="Segoe UI" w:hAnsi="Segoe UI" w:cs="Segoe UI"/>
+                <w:sz w:val="24"/>
+              </w:rPr>
+              <w:t>.is_pba %}PBA: {% endif %}{{</w:t>
+            </w:r>
+            <w:r>
+              <w:rPr>
+                <w:rFonts w:ascii="Segoe UI" w:hAnsi="Segoe UI" w:cs="Segoe UI"/>
                 <w:sz w:val="24"/>
               </w:rPr>
               <w:t xml:space="preserve"> </w:t>
             </w:r>
             <w:r>
               <w:rPr>
-                <w:rFonts w:ascii="Avenir Next"/>
+                <w:rFonts w:ascii="Segoe UI" w:hAnsi="Segoe UI" w:cs="Segoe UI"/>
                 <w:sz w:val="24"/>
               </w:rPr>
               <w:t>session</w:t>
             </w:r>
             <w:r>
               <w:rPr>
-                <w:rFonts w:ascii="Avenir Next"/>
+                <w:rFonts w:ascii="Segoe UI" w:hAnsi="Segoe UI" w:cs="Segoe UI"/>
                 <w:sz w:val="24"/>
               </w:rPr>
               <w:t>7</w:t>
             </w:r>
             <w:r>
               <w:rPr>
-                <w:rFonts w:ascii="Avenir Next"/>
+                <w:rFonts w:ascii="Segoe UI" w:hAnsi="Segoe UI" w:cs="Segoe UI"/>
                 <w:sz w:val="24"/>
               </w:rPr>
               <w:t>.activity }}</w:t>
@@ -2027,7 +2127,7 @@
               <w:spacing w:before="0"/>
               <w:ind w:left="0"/>
               <w:rPr>
-                <w:rFonts w:ascii="Times New Roman"/>
+                <w:rFonts w:ascii="Segoe UI" w:hAnsi="Segoe UI" w:cs="Segoe UI"/>
                 <w:sz w:val="24"/>
               </w:rPr>
             </w:pPr>
@@ -2049,6 +2149,7 @@
           <w:p>
             <w:pPr>
               <w:rPr>
+                <w:rFonts w:ascii="Segoe UI" w:hAnsi="Segoe UI" w:cs="Segoe UI"/>
                 <w:sz w:val="2"/>
                 <w:szCs w:val="2"/>
               </w:rPr>
@@ -2065,13 +2166,13 @@
               <w:pStyle w:val="TableParagraph"/>
               <w:spacing w:line="306" w:lineRule="exact"/>
               <w:rPr>
-                <w:rFonts w:ascii="Avenir Next"/>
-                <w:sz w:val="24"/>
-              </w:rPr>
-            </w:pPr>
-            <w:r>
-              <w:rPr>
-                <w:rFonts w:ascii="Avenir Next"/>
+                <w:rFonts w:ascii="Segoe UI" w:hAnsi="Segoe UI" w:cs="Segoe UI"/>
+                <w:sz w:val="24"/>
+              </w:rPr>
+            </w:pPr>
+            <w:r>
+              <w:rPr>
+                <w:rFonts w:ascii="Segoe UI" w:hAnsi="Segoe UI" w:cs="Segoe UI"/>
                 <w:spacing w:val="-5"/>
                 <w:sz w:val="24"/>
               </w:rPr>
@@ -2079,7 +2180,7 @@
             </w:r>
             <w:r>
               <w:rPr>
-                <w:rFonts w:ascii="Avenir Next"/>
+                <w:rFonts w:ascii="Segoe UI" w:hAnsi="Segoe UI" w:cs="Segoe UI"/>
                 <w:spacing w:val="-5"/>
                 <w:sz w:val="24"/>
               </w:rPr>
@@ -2087,7 +2188,7 @@
             </w:r>
             <w:r>
               <w:rPr>
-                <w:rFonts w:ascii="Avenir Next"/>
+                <w:rFonts w:ascii="Segoe UI" w:hAnsi="Segoe UI" w:cs="Segoe UI"/>
                 <w:spacing w:val="-5"/>
                 <w:sz w:val="24"/>
               </w:rPr>
@@ -2105,12 +2206,25 @@
         </w:tabs>
         <w:spacing w:before="240"/>
         <w:ind w:left="5429"/>
+        <w:rPr>
+          <w:rFonts w:ascii="Segoe UI" w:hAnsi="Segoe UI" w:cs="Segoe UI"/>
+          <w:b/>
+          <w:bCs/>
+        </w:rPr>
       </w:pPr>
       <w:r>
+        <w:rPr>
+          <w:rFonts w:ascii="Segoe UI" w:hAnsi="Segoe UI" w:cs="Segoe UI"/>
+          <w:b/>
+          <w:bCs/>
+        </w:rPr>
         <w:t xml:space="preserve">Total Assessment Score: </w:t>
       </w:r>
       <w:r>
         <w:rPr>
+          <w:rFonts w:ascii="Segoe UI" w:hAnsi="Segoe UI" w:cs="Segoe UI"/>
+          <w:b/>
+          <w:bCs/>
           <w:u w:val="single"/>
         </w:rPr>
         <w:tab/>
@@ -2123,11 +2237,12 @@
         <w:ind w:right="310"/>
         <w:jc w:val="right"/>
         <w:rPr>
-          <w:rFonts w:ascii="Arial"/>
+          <w:rFonts w:ascii="Segoe UI" w:hAnsi="Segoe UI" w:cs="Segoe UI"/>
         </w:rPr>
       </w:pPr>
       <w:r>
         <w:rPr>
+          <w:rFonts w:ascii="Segoe UI" w:hAnsi="Segoe UI" w:cs="Segoe UI"/>
           <w:noProof/>
         </w:rPr>
         <w:lastRenderedPageBreak/>
@@ -2177,6 +2292,7 @@
       </w:r>
       <w:r>
         <w:rPr>
+          <w:rFonts w:ascii="Segoe UI" w:hAnsi="Segoe UI" w:cs="Segoe UI"/>
           <w:noProof/>
         </w:rPr>
         <w:drawing>
@@ -2225,7 +2341,7 @@
       </w:r>
       <w:r>
         <w:rPr>
-          <w:rFonts w:ascii="Arial"/>
+          <w:rFonts w:ascii="Segoe UI" w:hAnsi="Segoe UI" w:cs="Segoe UI"/>
           <w:spacing w:val="-10"/>
         </w:rPr>
         <w:t>1</w:t>

</xml_diff>